<commit_message>
docs(legal): fill the company details into the algorithm filing
Every 【…】 placeholder in
落实算法安全主体责任基本情况-知是科创（北京）信息技术有限公司.docx is now
replaced: the name of the algorithm security office, the legal
representative, the office head and the technical lead, the staff count,
the contact number, the duty each system assigns, and the effective date
of the four attached systems.

Two claims in the filing did not match the platform: the office head was
left in brackets in ten places, and account deletion was described as a
setting in the app when it is done by mail. The deletion path now gives
the support address. The template's author metadata is left behind.

Co-authored-by: cheese-c82aeb40555a <cheese-c82aeb40555a@agent.cheese.local>
Co-authored-by: Claude Code <noreply@anthropic.com>
Co-authored-by: lambda-__-delta4477 <222958366+WangChangxin0809@users.noreply.github.com>
</commit_message>
<xml_diff>
--- a/落实算法安全主体责任基本情况-知是科创（北京）信息技术有限公司.docx
+++ b/落实算法安全主体责任基本情况-知是科创（北京）信息技术有限公司.docx
@@ -134,7 +134,7 @@
         <w:rPr>
           <w:rFonts w:hint="eastAsia"/>
         </w:rPr>
-        <w:t xml:space="preserve">算法安全专职机构名称：【算法安全专职机构名称】。机构负责人：【姓名·职务】，联系方式：【联系方式】。机构向公司【】报告工作。</w:t>
+        <w:t xml:space="preserve">算法安全专职机构名称：知是科创算法安全工作组。法定代表人、算法安全负责人：安岳；机构负责人：李知非（总经理）；技术负责人：彭文博（CTO 技术总监）；联系方式：18612366096。机构向公司总经理报告工作。</w:t>
       </w:r>
     </w:p>
     <w:p>
@@ -263,7 +263,7 @@
         <w:rPr>
           <w:rFonts w:hint="eastAsia"/>
         </w:rPr>
-        <w:t xml:space="preserve">算法安全专职机构现有工作人员【】人，其中专职【】人，由【】统筹日常协调，由【算法安全专职机构负责人】召集跨岗位事项。</w:t>
+        <w:t xml:space="preserve">算法安全专职机构现有工作人员 3 人，其中专职 3 人，由算法安全专职机构负责人统筹日常协调并召集跨岗位事项。</w:t>
       </w:r>
     </w:p>
     <w:p>
@@ -495,7 +495,7 @@
         <w:rPr>
           <w:rFonts w:hint="eastAsia"/>
         </w:rPr>
-        <w:t xml:space="preserve">自评估由算法安全专职机构组织，技术、产品、法务合规等岗位人员参加，必要时委托外部专业机构提供支持。评估形成书面自评估报告，载明结论、发现的问题、整改措施、责任人和完成时限；整改完成后由【算法安全专职机构负责人】复核确认；自评估报告与整改记录由【】归档保存，保存期限不少于 3 年。</w:t>
+        <w:t xml:space="preserve">自评估由算法安全专职机构组织，技术、产品、法务合规等岗位人员参加，必要时委托外部专业机构提供支持。评估形成书面自评估报告，载明结论、发现的问题、整改措施、责任人和完成时限；整改完成后由算法安全专职机构负责人复核确认；自评估报告与整改记录由算法安全专职机构归档保存，保存期限不少于 3 年。</w:t>
       </w:r>
     </w:p>
     <w:p>
@@ -621,7 +621,7 @@
         <w:rPr>
           <w:rFonts w:hint="eastAsia"/>
         </w:rPr>
-        <w:t xml:space="preserve">技术保障措施：平台留存智能体运行过程的完整记录（对话记录、调用过程），用于事后核查；模型调用统一经平台网关，记录所用模型、用量、费用和耗时；对模型调用实行额度与频次限制，防止批量滥用；上述记录由【】定期抽查。</w:t>
+        <w:t xml:space="preserve">技术保障措施：平台留存智能体运行过程的完整记录（对话记录、调用过程），用于事后核查；模型调用统一经平台网关，记录所用模型、用量、费用和耗时；对模型调用实行额度与频次限制，防止批量滥用；上述记录由算法安全专职机构定期抽查。</w:t>
       </w:r>
     </w:p>
     <w:p>
@@ -747,7 +747,7 @@
         <w:rPr>
           <w:rFonts w:hint="eastAsia"/>
         </w:rPr>
-        <w:t xml:space="preserve">制度建设：公司按《知是隐私政策》处理用户个人信息，只处理提供对应功能所必需的信息；实名信息属于选填项，不提供不影响使用本平台的其他功能；不满 14 周岁的未成年人须在监护人同意后使用本平台，发现未经监护人同意收集其个人信息的，尽快删除。用户可以在「个人设置」中查阅、更正、删除个人信息，撤回同意并注销账号；公司与用户约定的答复时限为 15 个工作日。</w:t>
+        <w:t xml:space="preserve">制度建设：公司按《知是隐私政策》处理用户个人信息，只处理提供对应功能所必需的信息；实名信息属于选填项，不提供不影响使用本平台的其他功能；不满 14 周岁的未成年人须在监护人同意后使用本平台，发现未经监护人同意收集其个人信息的，尽快删除。用户可以在「个人设置」中查阅、更正、删除个人信息，撤回同意；注销账号可发邮件至 ops@okcheese.com；公司与用户约定的答复时限为 15 个工作日。</w:t>
       </w:r>
     </w:p>
     <w:p>
@@ -895,7 +895,7 @@
         <w:rPr>
           <w:rFonts w:hint="eastAsia"/>
         </w:rPr>
-        <w:t xml:space="preserve">平台成员和员工发现上述情形的，应当在 24 小时内向算法安全专职机构报告，【算法安全专职机构负责人】为第一责任人；发现人应当保留现场记录，包括对话记录、模型调用记录和系统日志，不得擅自删除。</w:t>
+        <w:t xml:space="preserve">平台成员和员工发现上述情形的，应当在 24 小时内向算法安全专职机构报告，算法安全专职机构负责人为第一责任人；发现人应当保留现场记录，包括对话记录、模型调用记录和系统日志，不得擅自删除。</w:t>
       </w:r>
     </w:p>
     <w:p>
@@ -917,7 +917,7 @@
         <w:rPr>
           <w:rFonts w:hint="eastAsia"/>
         </w:rPr>
-        <w:t xml:space="preserve">（1）先行控制：视情况暂停相关的算法功能、模型调用或者账号权限，保全证据；（2）核查定位：由算法安全专职机构组织技术人员核查事件原因、影响范围和影响程度；（3）处置整改：删除违规内容、修复缺陷、调整模型配置或者权限策略，对受影响用户采取补救措施；（4）告知与报告：涉及用户个人信息的，按法律要求告知用户；依法需要向主管部门报告的，由【】按规定报告并按要求续报；（5）恢复：风险消除、整改完成并经【算法安全专职机构负责人】确认后，恢复相关功能。</w:t>
+        <w:t xml:space="preserve">（1）先行控制：视情况暂停相关的算法功能、模型调用或者账号权限，保全证据；（2）核查定位：由算法安全专职机构组织技术人员核查事件原因、影响范围和影响程度；（3）处置整改：删除违规内容、修复缺陷、调整模型配置或者权限策略，对受影响用户采取补救措施；（4）告知与报告：涉及用户个人信息的，按法律要求告知用户；依法需要向主管部门报告的，由算法安全专职机构按规定报告并按要求续报；（5）恢复：风险消除、整改完成并经算法安全专职机构负责人确认后，恢复相关功能。</w:t>
       </w:r>
     </w:p>
     <w:p>
@@ -939,7 +939,7 @@
         <w:rPr>
           <w:rFonts w:hint="eastAsia"/>
         </w:rPr>
-        <w:t xml:space="preserve">应急处置由算法安全专职机构统一协调，技术、产品、法务、客服等岗位按职责响应，重大事件报公司【】决定。</w:t>
+        <w:t xml:space="preserve">应急处置由算法安全专职机构统一协调，技术、产品、法务、客服等岗位按职责响应，重大事件报公司总经理决定。</w:t>
       </w:r>
     </w:p>
     <w:p>
@@ -1087,7 +1087,7 @@
         <w:rPr>
           <w:rFonts w:hint="eastAsia"/>
         </w:rPr>
-        <w:t xml:space="preserve">算法安全专职机构受理违规线索，线索来源包括用户举报、监测发现、主管部门转办和内部报告；组织核查并收集、保全证据，听取当事人的陈述和申辩；由【算法安全专职机构负责人】作出处置决定，重大处置决定由公司【】审批；处置决定由【】执行并告知当事人；当事人有异议的，可以在 15 个工作日内向【】提出，公司在 15 个工作日内答复。</w:t>
+        <w:t xml:space="preserve">算法安全专职机构受理违规线索，线索来源包括用户举报、监测发现、主管部门转办和内部报告；组织核查并收集、保全证据，听取当事人的陈述和申辩；由算法安全专职机构负责人作出处置决定，重大处置决定由公司总经理审批；处置决定由算法安全专职机构执行并告知当事人；当事人有异议的，可以在 15 个工作日内向 ops@okcheese.com 提出，公司在 15 个工作日内答复。</w:t>
       </w:r>
     </w:p>
     <w:p>
@@ -1410,29 +1410,29 @@
         <w:rPr>
           <w:rFonts w:hint="eastAsia"/>
         </w:rPr>
-        <w:t xml:space="preserve">第十条　整改完成后由【算法安全专职机构负责人】复核确认；复核未通过的，重新整改。</w:t>
-      </w:r>
-    </w:p>
-    <w:p>
-      <w:pPr>
-        <w:ind w:firstLine="640"/>
-      </w:pPr>
-      <w:r>
-        <w:rPr>
-          <w:rFonts w:hint="eastAsia"/>
-        </w:rPr>
-        <w:t xml:space="preserve">第十一条　自评估报告与整改记录由【】归档保存，保存期限不少于 3 年。</w:t>
-      </w:r>
-    </w:p>
-    <w:p>
-      <w:pPr>
-        <w:ind w:firstLine="640"/>
-      </w:pPr>
-      <w:r>
-        <w:rPr>
-          <w:rFonts w:hint="eastAsia"/>
-        </w:rPr>
-        <w:t xml:space="preserve">第十二条　自评估结果向公司【】报告，并在算法备案、监督检查等工作中按要求提供。</w:t>
+        <w:t xml:space="preserve">第十条　整改完成后由算法安全专职机构负责人复核确认；复核未通过的，重新整改。</w:t>
+      </w:r>
+    </w:p>
+    <w:p>
+      <w:pPr>
+        <w:ind w:firstLine="640"/>
+      </w:pPr>
+      <w:r>
+        <w:rPr>
+          <w:rFonts w:hint="eastAsia"/>
+        </w:rPr>
+        <w:t xml:space="preserve">第十一条　自评估报告与整改记录由算法安全专职机构归档保存，保存期限不少于 3 年。</w:t>
+      </w:r>
+    </w:p>
+    <w:p>
+      <w:pPr>
+        <w:ind w:firstLine="640"/>
+      </w:pPr>
+      <w:r>
+        <w:rPr>
+          <w:rFonts w:hint="eastAsia"/>
+        </w:rPr>
+        <w:t xml:space="preserve">第十二条　自评估结果向公司总经理报告，并在算法备案、监督检查等工作中按要求提供。</w:t>
       </w:r>
     </w:p>
     <w:p>
@@ -1464,7 +1464,7 @@
         <w:rPr>
           <w:rFonts w:hint="eastAsia"/>
         </w:rPr>
-        <w:t xml:space="preserve">第十四条　本制度自【】年【】月【】日起施行。</w:t>
+        <w:t xml:space="preserve">第十四条　本制度自 2026 年 10 月 8 日起施行。</w:t>
       </w:r>
     </w:p>
     <w:p>
@@ -1565,7 +1565,7 @@
         <w:rPr>
           <w:rFonts w:hint="eastAsia"/>
         </w:rPr>
-        <w:t xml:space="preserve">第六条　技术保障措施：平台留存智能体运行过程的完整记录（对话记录、调用过程）；模型调用统一经平台网关，记录所用模型、用量、费用和耗时；对调用实行额度与频次限制；上述记录由【】定期抽查。</w:t>
+        <w:t xml:space="preserve">第六条　技术保障措施：平台留存智能体运行过程的完整记录（对话记录、调用过程）；模型调用统一经平台网关，记录所用模型、用量、费用和耗时；对调用实行额度与频次限制；上述记录由算法安全专职机构定期抽查。</w:t>
       </w:r>
     </w:p>
     <w:p>
@@ -1651,7 +1651,7 @@
         <w:rPr>
           <w:rFonts w:hint="eastAsia"/>
         </w:rPr>
-        <w:t xml:space="preserve">第十二条　用户可以在「个人设置」中查阅、更正、删除个人信息，撤回同意并注销账号；公司自收到用户请求起 15 个工作日内答复。</w:t>
+        <w:t xml:space="preserve">第十二条　用户可以在「个人设置」中查阅、更正、删除个人信息，撤回同意；注销账号可发邮件至 ops@okcheese.com；公司自收到用户请求起 15 个工作日内答复。</w:t>
       </w:r>
     </w:p>
     <w:p>
@@ -1737,7 +1737,7 @@
         <w:rPr>
           <w:rFonts w:hint="eastAsia"/>
         </w:rPr>
-        <w:t xml:space="preserve">第十八条　监测记录由【】汇总，每季度报告一次；发现重大风险的，立即报告【算法安全专职机构负责人】。</w:t>
+        <w:t xml:space="preserve">第十八条　监测记录由算法安全专职机构汇总，每季度报告一次；发现重大风险的，立即报告算法安全专职机构负责人。</w:t>
       </w:r>
     </w:p>
     <w:p>
@@ -1758,7 +1758,7 @@
         <w:rPr>
           <w:rFonts w:hint="eastAsia"/>
         </w:rPr>
-        <w:t xml:space="preserve">第十九条　本制度由公司算法安全专职机构负责解释和修订，自【】年【】月【】日起施行。</w:t>
+        <w:t xml:space="preserve">第十九条　本制度由公司算法安全专职机构负责解释和修订，自 2026 年 10 月 8 日起施行。</w:t>
       </w:r>
     </w:p>
     <w:p>
@@ -1848,7 +1848,7 @@
         <w:rPr>
           <w:rFonts w:hint="eastAsia"/>
         </w:rPr>
-        <w:t xml:space="preserve">第五条　发现人应当在 24 小时内向算法安全专职机构报告，【算法安全专职机构负责人】为第一责任人；依法应当向主管部门报告的，由【】按规定报告。</w:t>
+        <w:t xml:space="preserve">第五条　发现人应当在 24 小时内向算法安全专职机构报告，算法安全专职机构负责人为第一责任人；依法应当向主管部门报告的，由算法安全专职机构按规定报告。</w:t>
       </w:r>
     </w:p>
     <w:p>
@@ -1935,7 +1935,7 @@
         <w:rPr>
           <w:rFonts w:hint="eastAsia"/>
         </w:rPr>
-        <w:t xml:space="preserve">第十二条　恢复：风险消除、整改完成并经【算法安全专职机构负责人】确认后，恢复相关功能。</w:t>
+        <w:t xml:space="preserve">第十二条　恢复：风险消除、整改完成并经算法安全专职机构负责人确认后，恢复相关功能。</w:t>
       </w:r>
     </w:p>
     <w:p>
@@ -1988,7 +1988,7 @@
         <w:rPr>
           <w:rFonts w:hint="eastAsia"/>
         </w:rPr>
-        <w:t xml:space="preserve">第十五条　本制度由公司算法安全专职机构负责解释和修订，自【】年【】月【】日起施行。</w:t>
+        <w:t xml:space="preserve">第十五条　本制度由公司算法安全专职机构负责解释和修订，自 2026 年 10 月 8 日起施行。</w:t>
       </w:r>
     </w:p>
     <w:p>
@@ -2175,29 +2175,29 @@
         <w:rPr>
           <w:rFonts w:hint="eastAsia"/>
         </w:rPr>
-        <w:t xml:space="preserve">第十二条　决定：由【算法安全专职机构负责人】作出处置决定，重大处置决定由公司【】审批。</w:t>
-      </w:r>
-    </w:p>
-    <w:p>
-      <w:pPr>
-        <w:ind w:firstLine="640"/>
-      </w:pPr>
-      <w:r>
-        <w:rPr>
-          <w:rFonts w:hint="eastAsia"/>
-        </w:rPr>
-        <w:t xml:space="preserve">第十三条　执行与告知：处置决定由【】执行，并告知当事人。</w:t>
-      </w:r>
-    </w:p>
-    <w:p>
-      <w:pPr>
-        <w:ind w:firstLine="640"/>
-      </w:pPr>
-      <w:r>
-        <w:rPr>
-          <w:rFonts w:hint="eastAsia"/>
-        </w:rPr>
-        <w:t xml:space="preserve">第十四条　异议：当事人有异议的，可以在 15 个工作日内向【】提出，公司在 15 个工作日内答复。</w:t>
+        <w:t xml:space="preserve">第十二条　决定：由算法安全专职机构负责人作出处置决定，重大处置决定由公司总经理审批。</w:t>
+      </w:r>
+    </w:p>
+    <w:p>
+      <w:pPr>
+        <w:ind w:firstLine="640"/>
+      </w:pPr>
+      <w:r>
+        <w:rPr>
+          <w:rFonts w:hint="eastAsia"/>
+        </w:rPr>
+        <w:t xml:space="preserve">第十三条　执行与告知：处置决定由算法安全专职机构执行，并告知当事人。</w:t>
+      </w:r>
+    </w:p>
+    <w:p>
+      <w:pPr>
+        <w:ind w:firstLine="640"/>
+      </w:pPr>
+      <w:r>
+        <w:rPr>
+          <w:rFonts w:hint="eastAsia"/>
+        </w:rPr>
+        <w:t xml:space="preserve">第十四条　异议：当事人有异议的，可以在 15 个工作日内向 ops@okcheese.com 提出，公司在 15 个工作日内答复。</w:t>
       </w:r>
     </w:p>
     <w:p>
@@ -2229,7 +2229,7 @@
         <w:rPr>
           <w:rFonts w:hint="eastAsia"/>
         </w:rPr>
-        <w:t xml:space="preserve">第十六条　本制度由公司算法安全专职机构负责解释和修订，自【】年【】月【】日起施行。</w:t>
+        <w:t xml:space="preserve">第十六条　本制度由公司算法安全专职机构负责解释和修订，自 2026 年 10 月 8 日起施行。</w:t>
       </w:r>
     </w:p>
     <w:sectPr>

</xml_diff>